<commit_message>
Phase 3 Final Submission: Add required documentation, update score to 9/10, fix timeout bounds
</commit_message>
<xml_diff>
--- a/docs/Phase2_Report.docx
+++ b/docs/Phase2_Report.docx
@@ -123,6 +123,79 @@
         </w:rPr>
         <w:t>]</w:t>
       </w:r>
+    </w:p>
+    <w:p>
+      <w:pPr>
+        <w:pStyle w:val="Heading1"/>
+        <w:rPr>
+          <w:rFonts w:ascii="Times New Roman" w:hAnsi="Times New Roman" w:cs="Times New Roman"/>
+          <w:sz w:val="20"/>
+          <w:szCs w:val="20"/>
+        </w:rPr>
+      </w:pPr>
+    </w:p>
+    <w:p>
+      <w:pPr>
+        <w:pStyle w:val="Heading1"/>
+        <w:rPr>
+          <w:rFonts w:ascii="Times New Roman" w:hAnsi="Times New Roman" w:cs="Times New Roman"/>
+          <w:sz w:val="20"/>
+          <w:szCs w:val="20"/>
+        </w:rPr>
+      </w:pPr>
+      <w:r>
+        <w:rPr>
+          <w:rFonts w:ascii="Times New Roman" w:hAnsi="Times New Roman" w:cs="Times New Roman"/>
+          <w:sz w:val="20"/>
+          <w:szCs w:val="20"/>
+        </w:rPr>
+        <w:t>GitHub</w:t>
+      </w:r>
+      <w:r>
+        <w:rPr>
+          <w:rFonts w:ascii="Times New Roman" w:hAnsi="Times New Roman" w:cs="Times New Roman"/>
+          <w:sz w:val="20"/>
+          <w:szCs w:val="20"/>
+        </w:rPr>
+        <w:t xml:space="preserve"> Repo Link – “</w:t>
+      </w:r>
+      <w:hyperlink r:id="rId5" w:history="1">
+        <w:r>
+          <w:rPr>
+            <w:rStyle w:val="Hyperlink"/>
+            <w:rFonts w:ascii="Times New Roman" w:hAnsi="Times New Roman" w:cs="Times New Roman"/>
+            <w:sz w:val="20"/>
+            <w:szCs w:val="20"/>
+          </w:rPr>
+          <w:t>https://github.com/makhijanijatin02/cod</w:t>
+        </w:r>
+        <w:r>
+          <w:rPr>
+            <w:rStyle w:val="Hyperlink"/>
+            <w:rFonts w:ascii="Times New Roman" w:hAnsi="Times New Roman" w:cs="Times New Roman"/>
+            <w:sz w:val="20"/>
+            <w:szCs w:val="20"/>
+          </w:rPr>
+          <w:t>e</w:t>
+        </w:r>
+        <w:r>
+          <w:rPr>
+            <w:rStyle w:val="Hyperlink"/>
+            <w:rFonts w:ascii="Times New Roman" w:hAnsi="Times New Roman" w:cs="Times New Roman"/>
+            <w:sz w:val="20"/>
+            <w:szCs w:val="20"/>
+          </w:rPr>
+          <w:t>x_verification_agent_for_rtl_testbench_generation</w:t>
+        </w:r>
+      </w:hyperlink>
+      <w:r>
+        <w:rPr>
+          <w:rFonts w:ascii="Times New Roman" w:hAnsi="Times New Roman" w:cs="Times New Roman"/>
+          <w:sz w:val="20"/>
+          <w:szCs w:val="20"/>
+        </w:rPr>
+        <w:t>”</w:t>
+      </w:r>
       <w:r>
         <w:rPr>
           <w:rFonts w:ascii="Times New Roman" w:hAnsi="Times New Roman" w:cs="Times New Roman"/>
@@ -1277,6 +1350,7 @@
           <w:rFonts w:ascii="Times New Roman" w:hAnsi="Times New Roman" w:cs="Times New Roman"/>
           <w:szCs w:val="20"/>
         </w:rPr>
+        <w:lastRenderedPageBreak/>
         <w:t xml:space="preserve"> </w:t>
       </w:r>
       <w:r>
@@ -1782,6 +1856,7 @@
           <w:rFonts w:ascii="Times New Roman" w:hAnsi="Times New Roman" w:cs="Times New Roman"/>
           <w:szCs w:val="20"/>
         </w:rPr>
+        <w:lastRenderedPageBreak/>
         <w:t xml:space="preserve">- </w:t>
       </w:r>
       <w:proofErr w:type="spellStart"/>
@@ -2273,6 +2348,7 @@
           <w:sz w:val="20"/>
           <w:szCs w:val="20"/>
         </w:rPr>
+        <w:lastRenderedPageBreak/>
         <w:t xml:space="preserve">8. </w:t>
       </w:r>
       <w:r>
@@ -2327,449 +2403,449 @@
           <w:rFonts w:ascii="Times New Roman" w:hAnsi="Times New Roman" w:cs="Times New Roman"/>
           <w:szCs w:val="20"/>
         </w:rPr>
+        <w:t>- generating structured test plans</w:t>
+      </w:r>
+    </w:p>
+    <w:p>
+      <w:pPr>
+        <w:rPr>
+          <w:rFonts w:ascii="Times New Roman" w:hAnsi="Times New Roman" w:cs="Times New Roman"/>
+          <w:szCs w:val="20"/>
+        </w:rPr>
+      </w:pPr>
+      <w:r>
+        <w:rPr>
+          <w:rFonts w:ascii="Times New Roman" w:hAnsi="Times New Roman" w:cs="Times New Roman"/>
+          <w:szCs w:val="20"/>
+        </w:rPr>
+        <w:t>- generating and refining Verilog testbenches</w:t>
+      </w:r>
+    </w:p>
+    <w:p>
+      <w:pPr>
+        <w:rPr>
+          <w:rFonts w:ascii="Times New Roman" w:hAnsi="Times New Roman" w:cs="Times New Roman"/>
+          <w:szCs w:val="20"/>
+        </w:rPr>
+      </w:pPr>
+      <w:r>
+        <w:rPr>
+          <w:rFonts w:ascii="Times New Roman" w:hAnsi="Times New Roman" w:cs="Times New Roman"/>
+          <w:szCs w:val="20"/>
+        </w:rPr>
+        <w:t>Where AI works well:</w:t>
+      </w:r>
+    </w:p>
+    <w:p>
+      <w:pPr>
+        <w:rPr>
+          <w:rFonts w:ascii="Times New Roman" w:hAnsi="Times New Roman" w:cs="Times New Roman"/>
+          <w:szCs w:val="20"/>
+        </w:rPr>
+      </w:pPr>
+      <w:r>
+        <w:rPr>
+          <w:rFonts w:ascii="Times New Roman" w:hAnsi="Times New Roman" w:cs="Times New Roman"/>
+          <w:szCs w:val="20"/>
+        </w:rPr>
+        <w:t>- interpreting ambiguous natural-language behavior</w:t>
+      </w:r>
+    </w:p>
+    <w:p>
+      <w:pPr>
+        <w:rPr>
+          <w:rFonts w:ascii="Times New Roman" w:hAnsi="Times New Roman" w:cs="Times New Roman"/>
+          <w:szCs w:val="20"/>
+        </w:rPr>
+      </w:pPr>
+      <w:r>
+        <w:rPr>
+          <w:rFonts w:ascii="Times New Roman" w:hAnsi="Times New Roman" w:cs="Times New Roman"/>
+          <w:szCs w:val="20"/>
+        </w:rPr>
+        <w:t>- proposing useful directed and corner-case tests</w:t>
+      </w:r>
+    </w:p>
+    <w:p>
+      <w:pPr>
+        <w:rPr>
+          <w:rFonts w:ascii="Times New Roman" w:hAnsi="Times New Roman" w:cs="Times New Roman"/>
+          <w:szCs w:val="20"/>
+        </w:rPr>
+      </w:pPr>
+      <w:r>
+        <w:rPr>
+          <w:rFonts w:ascii="Times New Roman" w:hAnsi="Times New Roman" w:cs="Times New Roman"/>
+          <w:szCs w:val="20"/>
+        </w:rPr>
+        <w:t>- generating good first-pass testbenches for simpler combinational problems</w:t>
+      </w:r>
+    </w:p>
+    <w:p>
+      <w:pPr>
+        <w:rPr>
+          <w:rFonts w:ascii="Times New Roman" w:hAnsi="Times New Roman" w:cs="Times New Roman"/>
+          <w:szCs w:val="20"/>
+        </w:rPr>
+      </w:pPr>
+      <w:r>
+        <w:rPr>
+          <w:rFonts w:ascii="Times New Roman" w:hAnsi="Times New Roman" w:cs="Times New Roman"/>
+          <w:szCs w:val="20"/>
+        </w:rPr>
+        <w:t>Where AI is weaker:</w:t>
+      </w:r>
+    </w:p>
+    <w:p>
+      <w:pPr>
+        <w:rPr>
+          <w:rFonts w:ascii="Times New Roman" w:hAnsi="Times New Roman" w:cs="Times New Roman"/>
+          <w:szCs w:val="20"/>
+        </w:rPr>
+      </w:pPr>
+      <w:r>
+        <w:rPr>
+          <w:rFonts w:ascii="Times New Roman" w:hAnsi="Times New Roman" w:cs="Times New Roman"/>
+          <w:szCs w:val="20"/>
+        </w:rPr>
+        <w:t>- strict tool-compatibility details</w:t>
+      </w:r>
+    </w:p>
+    <w:p>
+      <w:pPr>
+        <w:rPr>
+          <w:rFonts w:ascii="Times New Roman" w:hAnsi="Times New Roman" w:cs="Times New Roman"/>
+          <w:szCs w:val="20"/>
+        </w:rPr>
+      </w:pPr>
+      <w:r>
+        <w:rPr>
+          <w:rFonts w:ascii="Times New Roman" w:hAnsi="Times New Roman" w:cs="Times New Roman"/>
+          <w:szCs w:val="20"/>
+        </w:rPr>
+        <w:t>- edge cases involving complex packed-vector indexing</w:t>
+      </w:r>
+    </w:p>
+    <w:p>
+      <w:pPr>
+        <w:rPr>
+          <w:rFonts w:ascii="Times New Roman" w:hAnsi="Times New Roman" w:cs="Times New Roman"/>
+          <w:szCs w:val="20"/>
+        </w:rPr>
+      </w:pPr>
+      <w:r>
+        <w:rPr>
+          <w:rFonts w:ascii="Times New Roman" w:hAnsi="Times New Roman" w:cs="Times New Roman"/>
+          <w:szCs w:val="20"/>
+        </w:rPr>
+        <w:t>- consistently generating simulator-safe Verilog for all interface styles</w:t>
+      </w:r>
+    </w:p>
+    <w:p>
+      <w:pPr>
+        <w:rPr>
+          <w:rFonts w:ascii="Times New Roman" w:hAnsi="Times New Roman" w:cs="Times New Roman"/>
+          <w:szCs w:val="20"/>
+        </w:rPr>
+      </w:pPr>
+      <w:r>
+        <w:rPr>
+          <w:rFonts w:ascii="Times New Roman" w:hAnsi="Times New Roman" w:cs="Times New Roman"/>
+          <w:szCs w:val="20"/>
+        </w:rPr>
+        <w:t>This means AI is effective for reasoning and candidate generation, but it still benefits from deterministic constraints and execution-based validation.</w:t>
+      </w:r>
+    </w:p>
+    <w:p>
+      <w:pPr>
+        <w:rPr>
+          <w:rFonts w:ascii="Times New Roman" w:hAnsi="Times New Roman" w:cs="Times New Roman"/>
+          <w:szCs w:val="20"/>
+        </w:rPr>
+      </w:pPr>
+    </w:p>
+    <w:p>
+      <w:pPr>
+        <w:pStyle w:val="Heading1"/>
+        <w:rPr>
+          <w:rFonts w:ascii="Times New Roman" w:hAnsi="Times New Roman" w:cs="Times New Roman"/>
+          <w:sz w:val="20"/>
+          <w:szCs w:val="20"/>
+        </w:rPr>
+      </w:pPr>
+      <w:r>
+        <w:rPr>
+          <w:rFonts w:ascii="Times New Roman" w:hAnsi="Times New Roman" w:cs="Times New Roman"/>
+          <w:sz w:val="20"/>
+          <w:szCs w:val="20"/>
+        </w:rPr>
+        <w:t xml:space="preserve">9. </w:t>
+      </w:r>
+      <w:r>
+        <w:rPr>
+          <w:rFonts w:ascii="Times New Roman" w:hAnsi="Times New Roman" w:cs="Times New Roman"/>
+          <w:sz w:val="20"/>
+          <w:szCs w:val="20"/>
+          <w:u w:val="single"/>
+        </w:rPr>
+        <w:t>Challenges, Limitations, Improvements</w:t>
+      </w:r>
+    </w:p>
+    <w:p>
+      <w:pPr>
+        <w:rPr>
+          <w:rFonts w:ascii="Times New Roman" w:hAnsi="Times New Roman" w:cs="Times New Roman"/>
+          <w:szCs w:val="20"/>
+        </w:rPr>
+      </w:pPr>
+      <w:r>
+        <w:rPr>
+          <w:rFonts w:ascii="Times New Roman" w:hAnsi="Times New Roman" w:cs="Times New Roman"/>
+          <w:szCs w:val="20"/>
+        </w:rPr>
+        <w:t>Key challenges:</w:t>
+      </w:r>
+    </w:p>
+    <w:p>
+      <w:pPr>
+        <w:rPr>
+          <w:rFonts w:ascii="Times New Roman" w:hAnsi="Times New Roman" w:cs="Times New Roman"/>
+          <w:szCs w:val="20"/>
+        </w:rPr>
+      </w:pPr>
+      <w:r>
+        <w:rPr>
+          <w:rFonts w:ascii="Times New Roman" w:hAnsi="Times New Roman" w:cs="Times New Roman"/>
+          <w:szCs w:val="20"/>
+        </w:rPr>
+        <w:t>- LLM timeouts on large prompts</w:t>
+      </w:r>
+    </w:p>
+    <w:p>
+      <w:pPr>
+        <w:rPr>
+          <w:rFonts w:ascii="Times New Roman" w:hAnsi="Times New Roman" w:cs="Times New Roman"/>
+          <w:szCs w:val="20"/>
+        </w:rPr>
+      </w:pPr>
+      <w:r>
+        <w:rPr>
+          <w:rFonts w:ascii="Times New Roman" w:hAnsi="Times New Roman" w:cs="Times New Roman"/>
+          <w:szCs w:val="20"/>
+        </w:rPr>
+        <w:t xml:space="preserve">- invisible progress </w:t>
+      </w:r>
+      <w:proofErr w:type="gramStart"/>
+      <w:r>
+        <w:rPr>
+          <w:rFonts w:ascii="Times New Roman" w:hAnsi="Times New Roman" w:cs="Times New Roman"/>
+          <w:szCs w:val="20"/>
+        </w:rPr>
+        <w:t>during</w:t>
+      </w:r>
+      <w:proofErr w:type="gramEnd"/>
+      <w:r>
+        <w:rPr>
+          <w:rFonts w:ascii="Times New Roman" w:hAnsi="Times New Roman" w:cs="Times New Roman"/>
+          <w:szCs w:val="20"/>
+        </w:rPr>
+        <w:t xml:space="preserve"> long generations</w:t>
+      </w:r>
+    </w:p>
+    <w:p>
+      <w:pPr>
+        <w:rPr>
+          <w:rFonts w:ascii="Times New Roman" w:hAnsi="Times New Roman" w:cs="Times New Roman"/>
+          <w:szCs w:val="20"/>
+        </w:rPr>
+      </w:pPr>
+      <w:r>
+        <w:rPr>
+          <w:rFonts w:ascii="Times New Roman" w:hAnsi="Times New Roman" w:cs="Times New Roman"/>
+          <w:szCs w:val="20"/>
+        </w:rPr>
+        <w:t>- generated testbenches missing timing-specific checks</w:t>
+      </w:r>
+    </w:p>
+    <w:p>
+      <w:pPr>
+        <w:rPr>
+          <w:rFonts w:ascii="Times New Roman" w:hAnsi="Times New Roman" w:cs="Times New Roman"/>
+          <w:szCs w:val="20"/>
+        </w:rPr>
+      </w:pPr>
+      <w:r>
+        <w:rPr>
+          <w:rFonts w:ascii="Times New Roman" w:hAnsi="Times New Roman" w:cs="Times New Roman"/>
+          <w:szCs w:val="20"/>
+        </w:rPr>
+        <w:t>- generated Verilog that compiles poorly on some interface patterns</w:t>
+      </w:r>
+    </w:p>
+    <w:p>
+      <w:pPr>
+        <w:rPr>
+          <w:rFonts w:ascii="Times New Roman" w:hAnsi="Times New Roman" w:cs="Times New Roman"/>
+          <w:szCs w:val="20"/>
+        </w:rPr>
+      </w:pPr>
+      <w:r>
+        <w:rPr>
+          <w:rFonts w:ascii="Times New Roman" w:hAnsi="Times New Roman" w:cs="Times New Roman"/>
+          <w:szCs w:val="20"/>
+        </w:rPr>
+        <w:t>Fixes implemented in this phase:</w:t>
+      </w:r>
+    </w:p>
+    <w:p>
+      <w:pPr>
+        <w:rPr>
+          <w:rFonts w:ascii="Times New Roman" w:hAnsi="Times New Roman" w:cs="Times New Roman"/>
+          <w:szCs w:val="20"/>
+        </w:rPr>
+      </w:pPr>
+      <w:r>
+        <w:rPr>
+          <w:rFonts w:ascii="Times New Roman" w:hAnsi="Times New Roman" w:cs="Times New Roman"/>
+          <w:szCs w:val="20"/>
+        </w:rPr>
+        <w:t>- configurable Codex timeout</w:t>
+      </w:r>
+    </w:p>
+    <w:p>
+      <w:pPr>
+        <w:rPr>
+          <w:rFonts w:ascii="Times New Roman" w:hAnsi="Times New Roman" w:cs="Times New Roman"/>
+          <w:szCs w:val="20"/>
+        </w:rPr>
+      </w:pPr>
+      <w:r>
+        <w:rPr>
+          <w:rFonts w:ascii="Times New Roman" w:hAnsi="Times New Roman" w:cs="Times New Roman"/>
+          <w:szCs w:val="20"/>
+        </w:rPr>
+        <w:t>- prompt compaction</w:t>
+      </w:r>
+    </w:p>
+    <w:p>
+      <w:pPr>
+        <w:rPr>
+          <w:rFonts w:ascii="Times New Roman" w:hAnsi="Times New Roman" w:cs="Times New Roman"/>
+          <w:szCs w:val="20"/>
+        </w:rPr>
+      </w:pPr>
+      <w:r>
+        <w:rPr>
+          <w:rFonts w:ascii="Times New Roman" w:hAnsi="Times New Roman" w:cs="Times New Roman"/>
+          <w:szCs w:val="20"/>
+        </w:rPr>
+        <w:t>- line-buffered logging</w:t>
+      </w:r>
+    </w:p>
+    <w:p>
+      <w:pPr>
+        <w:rPr>
+          <w:rFonts w:ascii="Times New Roman" w:hAnsi="Times New Roman" w:cs="Times New Roman"/>
+          <w:szCs w:val="20"/>
+        </w:rPr>
+      </w:pPr>
+      <w:r>
+        <w:rPr>
+          <w:rFonts w:ascii="Times New Roman" w:hAnsi="Times New Roman" w:cs="Times New Roman"/>
+          <w:szCs w:val="20"/>
+        </w:rPr>
+        <w:t>- deterministic synchronous-reset guard</w:t>
+      </w:r>
+    </w:p>
+    <w:p>
+      <w:pPr>
+        <w:rPr>
+          <w:rFonts w:ascii="Times New Roman" w:hAnsi="Times New Roman" w:cs="Times New Roman"/>
+          <w:szCs w:val="20"/>
+        </w:rPr>
+      </w:pPr>
+      <w:r>
+        <w:rPr>
+          <w:rFonts w:ascii="Times New Roman" w:hAnsi="Times New Roman" w:cs="Times New Roman"/>
+          <w:szCs w:val="20"/>
+        </w:rPr>
+        <w:t xml:space="preserve">- </w:t>
+      </w:r>
+      <w:proofErr w:type="spellStart"/>
+      <w:r>
+        <w:rPr>
+          <w:rFonts w:ascii="Times New Roman" w:hAnsi="Times New Roman" w:cs="Times New Roman"/>
+          <w:szCs w:val="20"/>
+        </w:rPr>
+        <w:t>iverilog</w:t>
+      </w:r>
+      <w:proofErr w:type="spellEnd"/>
+      <w:r>
+        <w:rPr>
+          <w:rFonts w:ascii="Times New Roman" w:hAnsi="Times New Roman" w:cs="Times New Roman"/>
+          <w:szCs w:val="20"/>
+        </w:rPr>
+        <w:t xml:space="preserve"> -g2012 compilation support</w:t>
+      </w:r>
+    </w:p>
+    <w:p>
+      <w:pPr>
+        <w:rPr>
+          <w:rFonts w:ascii="Times New Roman" w:hAnsi="Times New Roman" w:cs="Times New Roman"/>
+          <w:szCs w:val="20"/>
+        </w:rPr>
+      </w:pPr>
+      <w:r>
+        <w:rPr>
+          <w:rFonts w:ascii="Times New Roman" w:hAnsi="Times New Roman" w:cs="Times New Roman"/>
+          <w:szCs w:val="20"/>
+        </w:rPr>
+        <w:t>Main limitations:</w:t>
+      </w:r>
+    </w:p>
+    <w:p>
+      <w:pPr>
+        <w:rPr>
+          <w:rFonts w:ascii="Times New Roman" w:hAnsi="Times New Roman" w:cs="Times New Roman"/>
+          <w:szCs w:val="20"/>
+        </w:rPr>
+      </w:pPr>
+      <w:r>
+        <w:rPr>
+          <w:rFonts w:ascii="Times New Roman" w:hAnsi="Times New Roman" w:cs="Times New Roman"/>
+          <w:szCs w:val="20"/>
+        </w:rPr>
+        <w:t>- not yet evaluated on the full visible benchmark set</w:t>
+      </w:r>
+    </w:p>
+    <w:p>
+      <w:pPr>
+        <w:rPr>
+          <w:rFonts w:ascii="Times New Roman" w:hAnsi="Times New Roman" w:cs="Times New Roman"/>
+          <w:szCs w:val="20"/>
+        </w:rPr>
+      </w:pPr>
+      <w:r>
+        <w:rPr>
+          <w:rFonts w:ascii="Times New Roman" w:hAnsi="Times New Roman" w:cs="Times New Roman"/>
+          <w:szCs w:val="20"/>
+        </w:rPr>
+        <w:t>- not yet robust across all vectorized module shapes</w:t>
+      </w:r>
+    </w:p>
+    <w:p>
+      <w:pPr>
+        <w:rPr>
+          <w:rFonts w:ascii="Times New Roman" w:hAnsi="Times New Roman" w:cs="Times New Roman"/>
+          <w:szCs w:val="20"/>
+        </w:rPr>
+      </w:pPr>
+      <w:r>
+        <w:rPr>
+          <w:rFonts w:ascii="Times New Roman" w:hAnsi="Times New Roman" w:cs="Times New Roman"/>
+          <w:szCs w:val="20"/>
+        </w:rPr>
         <w:lastRenderedPageBreak/>
-        <w:t>- generating structured test plans</w:t>
-      </w:r>
-    </w:p>
-    <w:p>
-      <w:pPr>
-        <w:rPr>
-          <w:rFonts w:ascii="Times New Roman" w:hAnsi="Times New Roman" w:cs="Times New Roman"/>
-          <w:szCs w:val="20"/>
-        </w:rPr>
-      </w:pPr>
-      <w:r>
-        <w:rPr>
-          <w:rFonts w:ascii="Times New Roman" w:hAnsi="Times New Roman" w:cs="Times New Roman"/>
-          <w:szCs w:val="20"/>
-        </w:rPr>
-        <w:t>- generating and refining Verilog testbenches</w:t>
-      </w:r>
-    </w:p>
-    <w:p>
-      <w:pPr>
-        <w:rPr>
-          <w:rFonts w:ascii="Times New Roman" w:hAnsi="Times New Roman" w:cs="Times New Roman"/>
-          <w:szCs w:val="20"/>
-        </w:rPr>
-      </w:pPr>
-      <w:r>
-        <w:rPr>
-          <w:rFonts w:ascii="Times New Roman" w:hAnsi="Times New Roman" w:cs="Times New Roman"/>
-          <w:szCs w:val="20"/>
-        </w:rPr>
-        <w:t>Where AI works well:</w:t>
-      </w:r>
-    </w:p>
-    <w:p>
-      <w:pPr>
-        <w:rPr>
-          <w:rFonts w:ascii="Times New Roman" w:hAnsi="Times New Roman" w:cs="Times New Roman"/>
-          <w:szCs w:val="20"/>
-        </w:rPr>
-      </w:pPr>
-      <w:r>
-        <w:rPr>
-          <w:rFonts w:ascii="Times New Roman" w:hAnsi="Times New Roman" w:cs="Times New Roman"/>
-          <w:szCs w:val="20"/>
-        </w:rPr>
-        <w:t>- interpreting ambiguous natural-language behavior</w:t>
-      </w:r>
-    </w:p>
-    <w:p>
-      <w:pPr>
-        <w:rPr>
-          <w:rFonts w:ascii="Times New Roman" w:hAnsi="Times New Roman" w:cs="Times New Roman"/>
-          <w:szCs w:val="20"/>
-        </w:rPr>
-      </w:pPr>
-      <w:r>
-        <w:rPr>
-          <w:rFonts w:ascii="Times New Roman" w:hAnsi="Times New Roman" w:cs="Times New Roman"/>
-          <w:szCs w:val="20"/>
-        </w:rPr>
-        <w:t>- proposing useful directed and corner-case tests</w:t>
-      </w:r>
-    </w:p>
-    <w:p>
-      <w:pPr>
-        <w:rPr>
-          <w:rFonts w:ascii="Times New Roman" w:hAnsi="Times New Roman" w:cs="Times New Roman"/>
-          <w:szCs w:val="20"/>
-        </w:rPr>
-      </w:pPr>
-      <w:r>
-        <w:rPr>
-          <w:rFonts w:ascii="Times New Roman" w:hAnsi="Times New Roman" w:cs="Times New Roman"/>
-          <w:szCs w:val="20"/>
-        </w:rPr>
-        <w:t>- generating good first-pass testbenches for simpler combinational problems</w:t>
-      </w:r>
-    </w:p>
-    <w:p>
-      <w:pPr>
-        <w:rPr>
-          <w:rFonts w:ascii="Times New Roman" w:hAnsi="Times New Roman" w:cs="Times New Roman"/>
-          <w:szCs w:val="20"/>
-        </w:rPr>
-      </w:pPr>
-      <w:r>
-        <w:rPr>
-          <w:rFonts w:ascii="Times New Roman" w:hAnsi="Times New Roman" w:cs="Times New Roman"/>
-          <w:szCs w:val="20"/>
-        </w:rPr>
-        <w:t>Where AI is weaker:</w:t>
-      </w:r>
-    </w:p>
-    <w:p>
-      <w:pPr>
-        <w:rPr>
-          <w:rFonts w:ascii="Times New Roman" w:hAnsi="Times New Roman" w:cs="Times New Roman"/>
-          <w:szCs w:val="20"/>
-        </w:rPr>
-      </w:pPr>
-      <w:r>
-        <w:rPr>
-          <w:rFonts w:ascii="Times New Roman" w:hAnsi="Times New Roman" w:cs="Times New Roman"/>
-          <w:szCs w:val="20"/>
-        </w:rPr>
-        <w:t>- strict tool-compatibility details</w:t>
-      </w:r>
-    </w:p>
-    <w:p>
-      <w:pPr>
-        <w:rPr>
-          <w:rFonts w:ascii="Times New Roman" w:hAnsi="Times New Roman" w:cs="Times New Roman"/>
-          <w:szCs w:val="20"/>
-        </w:rPr>
-      </w:pPr>
-      <w:r>
-        <w:rPr>
-          <w:rFonts w:ascii="Times New Roman" w:hAnsi="Times New Roman" w:cs="Times New Roman"/>
-          <w:szCs w:val="20"/>
-        </w:rPr>
-        <w:t>- edge cases involving complex packed-vector indexing</w:t>
-      </w:r>
-    </w:p>
-    <w:p>
-      <w:pPr>
-        <w:rPr>
-          <w:rFonts w:ascii="Times New Roman" w:hAnsi="Times New Roman" w:cs="Times New Roman"/>
-          <w:szCs w:val="20"/>
-        </w:rPr>
-      </w:pPr>
-      <w:r>
-        <w:rPr>
-          <w:rFonts w:ascii="Times New Roman" w:hAnsi="Times New Roman" w:cs="Times New Roman"/>
-          <w:szCs w:val="20"/>
-        </w:rPr>
-        <w:t>- consistently generating simulator-safe Verilog for all interface styles</w:t>
-      </w:r>
-    </w:p>
-    <w:p>
-      <w:pPr>
-        <w:rPr>
-          <w:rFonts w:ascii="Times New Roman" w:hAnsi="Times New Roman" w:cs="Times New Roman"/>
-          <w:szCs w:val="20"/>
-        </w:rPr>
-      </w:pPr>
-      <w:r>
-        <w:rPr>
-          <w:rFonts w:ascii="Times New Roman" w:hAnsi="Times New Roman" w:cs="Times New Roman"/>
-          <w:szCs w:val="20"/>
-        </w:rPr>
-        <w:t>This means AI is effective for reasoning and candidate generation, but it still benefits from deterministic constraints and execution-based validation.</w:t>
-      </w:r>
-    </w:p>
-    <w:p>
-      <w:pPr>
-        <w:rPr>
-          <w:rFonts w:ascii="Times New Roman" w:hAnsi="Times New Roman" w:cs="Times New Roman"/>
-          <w:szCs w:val="20"/>
-        </w:rPr>
-      </w:pPr>
-    </w:p>
-    <w:p>
-      <w:pPr>
-        <w:pStyle w:val="Heading1"/>
-        <w:rPr>
-          <w:rFonts w:ascii="Times New Roman" w:hAnsi="Times New Roman" w:cs="Times New Roman"/>
-          <w:sz w:val="20"/>
-          <w:szCs w:val="20"/>
-        </w:rPr>
-      </w:pPr>
-      <w:r>
-        <w:rPr>
-          <w:rFonts w:ascii="Times New Roman" w:hAnsi="Times New Roman" w:cs="Times New Roman"/>
-          <w:sz w:val="20"/>
-          <w:szCs w:val="20"/>
-        </w:rPr>
-        <w:t xml:space="preserve">9. </w:t>
-      </w:r>
-      <w:r>
-        <w:rPr>
-          <w:rFonts w:ascii="Times New Roman" w:hAnsi="Times New Roman" w:cs="Times New Roman"/>
-          <w:sz w:val="20"/>
-          <w:szCs w:val="20"/>
-          <w:u w:val="single"/>
-        </w:rPr>
-        <w:t>Challenges, Limitations, Improvements</w:t>
-      </w:r>
-    </w:p>
-    <w:p>
-      <w:pPr>
-        <w:rPr>
-          <w:rFonts w:ascii="Times New Roman" w:hAnsi="Times New Roman" w:cs="Times New Roman"/>
-          <w:szCs w:val="20"/>
-        </w:rPr>
-      </w:pPr>
-      <w:r>
-        <w:rPr>
-          <w:rFonts w:ascii="Times New Roman" w:hAnsi="Times New Roman" w:cs="Times New Roman"/>
-          <w:szCs w:val="20"/>
-        </w:rPr>
-        <w:t>Key challenges:</w:t>
-      </w:r>
-    </w:p>
-    <w:p>
-      <w:pPr>
-        <w:rPr>
-          <w:rFonts w:ascii="Times New Roman" w:hAnsi="Times New Roman" w:cs="Times New Roman"/>
-          <w:szCs w:val="20"/>
-        </w:rPr>
-      </w:pPr>
-      <w:r>
-        <w:rPr>
-          <w:rFonts w:ascii="Times New Roman" w:hAnsi="Times New Roman" w:cs="Times New Roman"/>
-          <w:szCs w:val="20"/>
-        </w:rPr>
-        <w:t>- LLM timeouts on large prompts</w:t>
-      </w:r>
-    </w:p>
-    <w:p>
-      <w:pPr>
-        <w:rPr>
-          <w:rFonts w:ascii="Times New Roman" w:hAnsi="Times New Roman" w:cs="Times New Roman"/>
-          <w:szCs w:val="20"/>
-        </w:rPr>
-      </w:pPr>
-      <w:r>
-        <w:rPr>
-          <w:rFonts w:ascii="Times New Roman" w:hAnsi="Times New Roman" w:cs="Times New Roman"/>
-          <w:szCs w:val="20"/>
-        </w:rPr>
-        <w:t xml:space="preserve">- invisible progress </w:t>
-      </w:r>
-      <w:proofErr w:type="gramStart"/>
-      <w:r>
-        <w:rPr>
-          <w:rFonts w:ascii="Times New Roman" w:hAnsi="Times New Roman" w:cs="Times New Roman"/>
-          <w:szCs w:val="20"/>
-        </w:rPr>
-        <w:t>during</w:t>
-      </w:r>
-      <w:proofErr w:type="gramEnd"/>
-      <w:r>
-        <w:rPr>
-          <w:rFonts w:ascii="Times New Roman" w:hAnsi="Times New Roman" w:cs="Times New Roman"/>
-          <w:szCs w:val="20"/>
-        </w:rPr>
-        <w:t xml:space="preserve"> long generations</w:t>
-      </w:r>
-    </w:p>
-    <w:p>
-      <w:pPr>
-        <w:rPr>
-          <w:rFonts w:ascii="Times New Roman" w:hAnsi="Times New Roman" w:cs="Times New Roman"/>
-          <w:szCs w:val="20"/>
-        </w:rPr>
-      </w:pPr>
-      <w:r>
-        <w:rPr>
-          <w:rFonts w:ascii="Times New Roman" w:hAnsi="Times New Roman" w:cs="Times New Roman"/>
-          <w:szCs w:val="20"/>
-        </w:rPr>
-        <w:t>- generated testbenches missing timing-specific checks</w:t>
-      </w:r>
-    </w:p>
-    <w:p>
-      <w:pPr>
-        <w:rPr>
-          <w:rFonts w:ascii="Times New Roman" w:hAnsi="Times New Roman" w:cs="Times New Roman"/>
-          <w:szCs w:val="20"/>
-        </w:rPr>
-      </w:pPr>
-      <w:r>
-        <w:rPr>
-          <w:rFonts w:ascii="Times New Roman" w:hAnsi="Times New Roman" w:cs="Times New Roman"/>
-          <w:szCs w:val="20"/>
-        </w:rPr>
-        <w:t>- generated Verilog that compiles poorly on some interface patterns</w:t>
-      </w:r>
-    </w:p>
-    <w:p>
-      <w:pPr>
-        <w:rPr>
-          <w:rFonts w:ascii="Times New Roman" w:hAnsi="Times New Roman" w:cs="Times New Roman"/>
-          <w:szCs w:val="20"/>
-        </w:rPr>
-      </w:pPr>
-      <w:r>
-        <w:rPr>
-          <w:rFonts w:ascii="Times New Roman" w:hAnsi="Times New Roman" w:cs="Times New Roman"/>
-          <w:szCs w:val="20"/>
-        </w:rPr>
-        <w:t>Fixes implemented in this phase:</w:t>
-      </w:r>
-    </w:p>
-    <w:p>
-      <w:pPr>
-        <w:rPr>
-          <w:rFonts w:ascii="Times New Roman" w:hAnsi="Times New Roman" w:cs="Times New Roman"/>
-          <w:szCs w:val="20"/>
-        </w:rPr>
-      </w:pPr>
-      <w:r>
-        <w:rPr>
-          <w:rFonts w:ascii="Times New Roman" w:hAnsi="Times New Roman" w:cs="Times New Roman"/>
-          <w:szCs w:val="20"/>
-        </w:rPr>
-        <w:t>- configurable Codex timeout</w:t>
-      </w:r>
-    </w:p>
-    <w:p>
-      <w:pPr>
-        <w:rPr>
-          <w:rFonts w:ascii="Times New Roman" w:hAnsi="Times New Roman" w:cs="Times New Roman"/>
-          <w:szCs w:val="20"/>
-        </w:rPr>
-      </w:pPr>
-      <w:r>
-        <w:rPr>
-          <w:rFonts w:ascii="Times New Roman" w:hAnsi="Times New Roman" w:cs="Times New Roman"/>
-          <w:szCs w:val="20"/>
-        </w:rPr>
-        <w:t>- prompt compaction</w:t>
-      </w:r>
-    </w:p>
-    <w:p>
-      <w:pPr>
-        <w:rPr>
-          <w:rFonts w:ascii="Times New Roman" w:hAnsi="Times New Roman" w:cs="Times New Roman"/>
-          <w:szCs w:val="20"/>
-        </w:rPr>
-      </w:pPr>
-      <w:r>
-        <w:rPr>
-          <w:rFonts w:ascii="Times New Roman" w:hAnsi="Times New Roman" w:cs="Times New Roman"/>
-          <w:szCs w:val="20"/>
-        </w:rPr>
-        <w:t>- line-buffered logging</w:t>
-      </w:r>
-    </w:p>
-    <w:p>
-      <w:pPr>
-        <w:rPr>
-          <w:rFonts w:ascii="Times New Roman" w:hAnsi="Times New Roman" w:cs="Times New Roman"/>
-          <w:szCs w:val="20"/>
-        </w:rPr>
-      </w:pPr>
-      <w:r>
-        <w:rPr>
-          <w:rFonts w:ascii="Times New Roman" w:hAnsi="Times New Roman" w:cs="Times New Roman"/>
-          <w:szCs w:val="20"/>
-        </w:rPr>
-        <w:t>- deterministic synchronous-reset guard</w:t>
-      </w:r>
-    </w:p>
-    <w:p>
-      <w:pPr>
-        <w:rPr>
-          <w:rFonts w:ascii="Times New Roman" w:hAnsi="Times New Roman" w:cs="Times New Roman"/>
-          <w:szCs w:val="20"/>
-        </w:rPr>
-      </w:pPr>
-      <w:r>
-        <w:rPr>
-          <w:rFonts w:ascii="Times New Roman" w:hAnsi="Times New Roman" w:cs="Times New Roman"/>
-          <w:szCs w:val="20"/>
-        </w:rPr>
-        <w:t xml:space="preserve">- </w:t>
-      </w:r>
-      <w:proofErr w:type="spellStart"/>
-      <w:r>
-        <w:rPr>
-          <w:rFonts w:ascii="Times New Roman" w:hAnsi="Times New Roman" w:cs="Times New Roman"/>
-          <w:szCs w:val="20"/>
-        </w:rPr>
-        <w:t>iverilog</w:t>
-      </w:r>
-      <w:proofErr w:type="spellEnd"/>
-      <w:r>
-        <w:rPr>
-          <w:rFonts w:ascii="Times New Roman" w:hAnsi="Times New Roman" w:cs="Times New Roman"/>
-          <w:szCs w:val="20"/>
-        </w:rPr>
-        <w:t xml:space="preserve"> -g2012 compilation support</w:t>
-      </w:r>
-    </w:p>
-    <w:p>
-      <w:pPr>
-        <w:rPr>
-          <w:rFonts w:ascii="Times New Roman" w:hAnsi="Times New Roman" w:cs="Times New Roman"/>
-          <w:szCs w:val="20"/>
-        </w:rPr>
-      </w:pPr>
-      <w:r>
-        <w:rPr>
-          <w:rFonts w:ascii="Times New Roman" w:hAnsi="Times New Roman" w:cs="Times New Roman"/>
-          <w:szCs w:val="20"/>
-        </w:rPr>
-        <w:t>Main limitations:</w:t>
-      </w:r>
-    </w:p>
-    <w:p>
-      <w:pPr>
-        <w:rPr>
-          <w:rFonts w:ascii="Times New Roman" w:hAnsi="Times New Roman" w:cs="Times New Roman"/>
-          <w:szCs w:val="20"/>
-        </w:rPr>
-      </w:pPr>
-      <w:r>
-        <w:rPr>
-          <w:rFonts w:ascii="Times New Roman" w:hAnsi="Times New Roman" w:cs="Times New Roman"/>
-          <w:szCs w:val="20"/>
-        </w:rPr>
-        <w:t>- not yet evaluated on the full visible benchmark set</w:t>
-      </w:r>
-    </w:p>
-    <w:p>
-      <w:pPr>
-        <w:rPr>
-          <w:rFonts w:ascii="Times New Roman" w:hAnsi="Times New Roman" w:cs="Times New Roman"/>
-          <w:szCs w:val="20"/>
-        </w:rPr>
-      </w:pPr>
-      <w:r>
-        <w:rPr>
-          <w:rFonts w:ascii="Times New Roman" w:hAnsi="Times New Roman" w:cs="Times New Roman"/>
-          <w:szCs w:val="20"/>
-        </w:rPr>
-        <w:t>- not yet robust across all vectorized module shapes</w:t>
-      </w:r>
-    </w:p>
-    <w:p>
-      <w:pPr>
-        <w:rPr>
-          <w:rFonts w:ascii="Times New Roman" w:hAnsi="Times New Roman" w:cs="Times New Roman"/>
-          <w:szCs w:val="20"/>
-        </w:rPr>
-      </w:pPr>
-      <w:r>
-        <w:rPr>
-          <w:rFonts w:ascii="Times New Roman" w:hAnsi="Times New Roman" w:cs="Times New Roman"/>
-          <w:szCs w:val="20"/>
-        </w:rPr>
         <w:t>- refinement still depends partly on prompt behavior</w:t>
       </w:r>
     </w:p>
@@ -2815,7 +2891,6 @@
           <w:rFonts w:ascii="Times New Roman" w:hAnsi="Times New Roman" w:cs="Times New Roman"/>
           <w:szCs w:val="20"/>
         </w:rPr>
-        <w:lastRenderedPageBreak/>
         <w:t>- collect aggregate metrics</w:t>
       </w:r>
     </w:p>
@@ -3219,7 +3294,7 @@
           <w:rFonts w:ascii="Times New Roman" w:hAnsi="Times New Roman" w:cs="Times New Roman"/>
           <w:szCs w:val="20"/>
         </w:rPr>
-        <w:t>This project implements a concrete Codex-based RTL verification agent that reads a natural-language specification, generates a self-checking Verilog testbench, runs simulation against candidate implementations, and improves the workflow through execution feedback. The Phase 2 prototype already shows strong early performance on real ICLAD visible problems, while also exposing a meaningful failure mode that defines the next engineering target for Phase 3.</w:t>
+        <w:t>This project implements a concrete Codex-based RTL verification agent that reads a natural-language specification, generates a self-checking Verilog testbench, runs simulation against candidate implementations, and improves the workflow through execution feedback. The Phase 2 prototype already shows strong early performance on real ICLAD visible problems, while also exposing a meaningful failure mode that defines the next target for Phase 3.</w:t>
       </w:r>
     </w:p>
     <w:sectPr>
@@ -3763,6 +3838,7 @@
   <w:style w:type="character" w:default="1" w:styleId="DefaultParagraphFont">
     <w:name w:val="Default Paragraph Font"/>
     <w:uiPriority w:val="1"/>
+    <w:semiHidden/>
     <w:unhideWhenUsed/>
   </w:style>
   <w:style w:type="table" w:default="1" w:styleId="TableNormal">
@@ -3794,6 +3870,41 @@
     <w:rPr>
       <w:b/>
       <w:sz w:val="28"/>
+    </w:rPr>
+  </w:style>
+  <w:style w:type="character" w:styleId="Hyperlink">
+    <w:name w:val="Hyperlink"/>
+    <w:basedOn w:val="DefaultParagraphFont"/>
+    <w:uiPriority w:val="99"/>
+    <w:unhideWhenUsed/>
+    <w:rsid w:val="001D28E1"/>
+    <w:rPr>
+      <w:color w:val="467886" w:themeColor="hyperlink"/>
+      <w:u w:val="single"/>
+    </w:rPr>
+  </w:style>
+  <w:style w:type="character" w:styleId="UnresolvedMention">
+    <w:name w:val="Unresolved Mention"/>
+    <w:basedOn w:val="DefaultParagraphFont"/>
+    <w:uiPriority w:val="99"/>
+    <w:semiHidden/>
+    <w:unhideWhenUsed/>
+    <w:rsid w:val="001D28E1"/>
+    <w:rPr>
+      <w:color w:val="605E5C"/>
+      <w:shd w:val="clear" w:color="auto" w:fill="E1DFDD"/>
+    </w:rPr>
+  </w:style>
+  <w:style w:type="character" w:styleId="FollowedHyperlink">
+    <w:name w:val="FollowedHyperlink"/>
+    <w:basedOn w:val="DefaultParagraphFont"/>
+    <w:uiPriority w:val="99"/>
+    <w:semiHidden/>
+    <w:unhideWhenUsed/>
+    <w:rsid w:val="001D28E1"/>
+    <w:rPr>
+      <w:color w:val="96607D" w:themeColor="followedHyperlink"/>
+      <w:u w:val="single"/>
     </w:rPr>
   </w:style>
 </w:styles>

</xml_diff>